<commit_message>
Update strategie de recette: sync CI/Xray automatique
</commit_message>
<xml_diff>
--- a/docs/Strategie_Recette_SEMAFORE.docx
+++ b/docs/Strategie_Recette_SEMAFORE.docx
@@ -1965,6 +1965,107 @@
     </w:p>
     <w:p>
       <w:pPr>
+        <w:pStyle w:val="Heading2"/>
+        <w:spacing w:after="100" w:before="220"/>
+      </w:pPr>
+      <w:r>
+        <w:rPr>
+          <w:b/>
+          <w:bCs/>
+          <w:color w:val="1F3864"/>
+          <w:sz w:val="22"/>
+          <w:szCs w:val="22"/>
+        </w:rPr>
+        <w:t xml:space="preserve">4.1 Synchronisation automatique CI/CD → Xray</w:t>
+      </w:r>
+    </w:p>
+    <w:p>
+      <w:pPr>
+        <w:spacing w:after="120" w:line="276"/>
+      </w:pPr>
+      <w:r>
+        <w:rPr>
+          <w:color w:val="222222"/>
+          <w:sz w:val="21"/>
+          <w:szCs w:val="21"/>
+        </w:rPr>
+        <w:t xml:space="preserve">Le pipeline GitHub Actions pousse automatiquement les résultats des tests pytest vers la Test Execution SEMA-6 à chaque exécution, sans ressaisie manuelle :</w:t>
+      </w:r>
+    </w:p>
+    <w:p>
+      <w:pPr>
+        <w:pStyle w:val="ListParagraph"/>
+        <w:numPr>
+          <w:ilvl w:val="0"/>
+          <w:numId w:val="2"/>
+        </w:numPr>
+        <w:spacing w:after="60" w:line="264"/>
+      </w:pPr>
+      <w:r>
+        <w:rPr>
+          <w:color w:val="222222"/>
+          <w:sz w:val="21"/>
+          <w:szCs w:val="21"/>
+        </w:rPr>
+        <w:t xml:space="preserve">Chaque test pytest est mappé à sa clé Xray (SEMA-1 à SEMA-4) via la propriété JUnit test_key</w:t>
+      </w:r>
+    </w:p>
+    <w:p>
+      <w:pPr>
+        <w:pStyle w:val="ListParagraph"/>
+        <w:numPr>
+          <w:ilvl w:val="0"/>
+          <w:numId w:val="2"/>
+        </w:numPr>
+        <w:spacing w:after="60" w:line="264"/>
+      </w:pPr>
+      <w:r>
+        <w:rPr>
+          <w:color w:val="222222"/>
+          <w:sz w:val="21"/>
+          <w:szCs w:val="21"/>
+        </w:rPr>
+        <w:t xml:space="preserve">L'envoi des résultats s'exécute même en cas d'échec des tests, afin que les statuts FAILED soient également tracés dans Xray</w:t>
+      </w:r>
+    </w:p>
+    <w:p>
+      <w:pPr>
+        <w:pStyle w:val="ListParagraph"/>
+        <w:numPr>
+          <w:ilvl w:val="0"/>
+          <w:numId w:val="2"/>
+        </w:numPr>
+        <w:spacing w:after="60" w:line="264"/>
+      </w:pPr>
+      <w:r>
+        <w:rPr>
+          <w:color w:val="222222"/>
+          <w:sz w:val="21"/>
+          <w:szCs w:val="21"/>
+        </w:rPr>
+        <w:t xml:space="preserve">Authentification via API Client Xray Cloud, secrets stockés côté GitHub Actions (jamais en clair dans le dépôt)</w:t>
+      </w:r>
+    </w:p>
+    <w:p>
+      <w:pPr>
+        <w:pStyle w:val="ListParagraph"/>
+        <w:numPr>
+          <w:ilvl w:val="0"/>
+          <w:numId w:val="2"/>
+        </w:numPr>
+        <w:spacing w:after="60" w:line="264"/>
+      </w:pPr>
+      <w:r>
+        <w:rPr>
+          <w:color w:val="222222"/>
+          <w:sz w:val="21"/>
+          <w:szCs w:val="21"/>
+        </w:rPr>
+        <w:t xml:space="preserve">Boucle complète : exécution des tests → génération du rapport JUnit → import automatique dans Xray → mise à jour du statut d'exécution global</w:t>
+      </w:r>
+    </w:p>
+    <w:p>
+      <w:pPr>
         <w:pStyle w:val="Heading1"/>
         <w:pBdr>
           <w:bottom w:val="single" w:color="1F3864" w:sz="6" w:space="4"/>
@@ -2052,6 +2153,24 @@
           <w:szCs w:val="21"/>
         </w:rPr>
         <w:t xml:space="preserve">Pipeline CI/CD : le job échoue explicitement à l'étape des tests de non-régression tant que les anomalies de données ne sont pas résolues, matérialisant un contrôle qualité bloquant avant livraison</w:t>
+      </w:r>
+    </w:p>
+    <w:p>
+      <w:pPr>
+        <w:pStyle w:val="ListParagraph"/>
+        <w:numPr>
+          <w:ilvl w:val="0"/>
+          <w:numId w:val="2"/>
+        </w:numPr>
+        <w:spacing w:after="60" w:line="264"/>
+      </w:pPr>
+      <w:r>
+        <w:rPr>
+          <w:color w:val="222222"/>
+          <w:sz w:val="21"/>
+          <w:szCs w:val="21"/>
+        </w:rPr>
+        <w:t xml:space="preserve">Statut d'exécution Xray mis à jour automatiquement à chaque exécution du pipeline, qu'il y ait succès ou échec, garantissant une traçabilité continue sans ressaisie manuelle</w:t>
       </w:r>
     </w:p>
     <w:p>
@@ -2409,6 +2528,52 @@
                 <w:szCs w:val="19"/>
               </w:rPr>
               <w:t xml:space="preserve">.github/workflows/ci.yml</w:t>
+            </w:r>
+          </w:p>
+        </w:tc>
+      </w:tr>
+      <w:tr>
+        <w:tc>
+          <w:tcPr>
+            <w:tcMar>
+              <w:top w:type="dxa" w:w="80"/>
+              <w:left w:type="dxa" w:w="100"/>
+              <w:bottom w:type="dxa" w:w="80"/>
+              <w:right w:type="dxa" w:w="100"/>
+            </w:tcMar>
+          </w:tcPr>
+          <w:p>
+            <w:r>
+              <w:rPr>
+                <w:b w:val="false"/>
+                <w:bCs w:val="false"/>
+                <w:color w:val="222222"/>
+                <w:sz w:val="19"/>
+                <w:szCs w:val="19"/>
+              </w:rPr>
+              <w:t xml:space="preserve">Synchronisation Xray</w:t>
+            </w:r>
+          </w:p>
+        </w:tc>
+        <w:tc>
+          <w:tcPr>
+            <w:tcMar>
+              <w:top w:type="dxa" w:w="80"/>
+              <w:left w:type="dxa" w:w="100"/>
+              <w:bottom w:type="dxa" w:w="80"/>
+              <w:right w:type="dxa" w:w="100"/>
+            </w:tcMar>
+          </w:tcPr>
+          <w:p>
+            <w:r>
+              <w:rPr>
+                <w:b w:val="false"/>
+                <w:bCs w:val="false"/>
+                <w:color w:val="222222"/>
+                <w:sz w:val="19"/>
+                <w:szCs w:val="19"/>
+              </w:rPr>
+              <w:t xml:space="preserve">scripts/push_to_xray.py, pytest.ini</w:t>
             </w:r>
           </w:p>
         </w:tc>

</xml_diff>